<commit_message>
Phase 3: abstraction, constructors, access specifiers
</commit_message>
<xml_diff>
--- a/EmployeeManagementSystem/Documentation/EMS_Phase2_Design_Document.docx
+++ b/EmployeeManagementSystem/Documentation/EMS_Phase2_Design_Document.docx
@@ -60,16 +60,7 @@
           <w:sz w:val="24"/>
           <w:szCs w:val="24"/>
         </w:rPr>
-        <w:t>Author</w:t>
-      </w:r>
-      <w:r>
-        <w:rPr>
-          <w:b/>
-          <w:bCs/>
-          <w:sz w:val="24"/>
-          <w:szCs w:val="24"/>
-        </w:rPr>
-        <w:t xml:space="preserve">: </w:t>
+        <w:t xml:space="preserve">Author: </w:t>
       </w:r>
       <w:r>
         <w:rPr>
@@ -218,12 +209,6 @@
         <w:gridCol w:w="7130"/>
       </w:tblGrid>
       <w:tr>
-        <w:tblPrEx>
-          <w:tblCellMar>
-            <w:top w:w="0" w:type="dxa"/>
-            <w:bottom w:w="0" w:type="dxa"/>
-          </w:tblCellMar>
-        </w:tblPrEx>
         <w:trPr>
           <w:tblHeader/>
         </w:trPr>
@@ -291,12 +276,6 @@
         </w:tc>
       </w:tr>
       <w:tr>
-        <w:tblPrEx>
-          <w:tblCellMar>
-            <w:top w:w="0" w:type="dxa"/>
-            <w:bottom w:w="0" w:type="dxa"/>
-          </w:tblCellMar>
-        </w:tblPrEx>
         <w:tc>
           <w:tcPr>
             <w:tcW w:w="2000" w:type="dxa"/>
@@ -353,12 +332,6 @@
         </w:tc>
       </w:tr>
       <w:tr>
-        <w:tblPrEx>
-          <w:tblCellMar>
-            <w:top w:w="0" w:type="dxa"/>
-            <w:bottom w:w="0" w:type="dxa"/>
-          </w:tblCellMar>
-        </w:tblPrEx>
         <w:tc>
           <w:tcPr>
             <w:tcW w:w="2000" w:type="dxa"/>
@@ -415,12 +388,6 @@
         </w:tc>
       </w:tr>
       <w:tr>
-        <w:tblPrEx>
-          <w:tblCellMar>
-            <w:top w:w="0" w:type="dxa"/>
-            <w:bottom w:w="0" w:type="dxa"/>
-          </w:tblCellMar>
-        </w:tblPrEx>
         <w:tc>
           <w:tcPr>
             <w:tcW w:w="2000" w:type="dxa"/>
@@ -479,12 +446,6 @@
         </w:tc>
       </w:tr>
       <w:tr>
-        <w:tblPrEx>
-          <w:tblCellMar>
-            <w:top w:w="0" w:type="dxa"/>
-            <w:bottom w:w="0" w:type="dxa"/>
-          </w:tblCellMar>
-        </w:tblPrEx>
         <w:tc>
           <w:tcPr>
             <w:tcW w:w="2000" w:type="dxa"/>
@@ -543,12 +504,6 @@
         </w:tc>
       </w:tr>
       <w:tr>
-        <w:tblPrEx>
-          <w:tblCellMar>
-            <w:top w:w="0" w:type="dxa"/>
-            <w:bottom w:w="0" w:type="dxa"/>
-          </w:tblCellMar>
-        </w:tblPrEx>
         <w:tc>
           <w:tcPr>
             <w:tcW w:w="2000" w:type="dxa"/>
@@ -623,12 +578,6 @@
         </w:tc>
       </w:tr>
       <w:tr>
-        <w:tblPrEx>
-          <w:tblCellMar>
-            <w:top w:w="0" w:type="dxa"/>
-            <w:bottom w:w="0" w:type="dxa"/>
-          </w:tblCellMar>
-        </w:tblPrEx>
         <w:tc>
           <w:tcPr>
             <w:tcW w:w="2000" w:type="dxa"/>
@@ -738,12 +687,6 @@
         </w:tc>
       </w:tr>
       <w:tr>
-        <w:tblPrEx>
-          <w:tblCellMar>
-            <w:top w:w="0" w:type="dxa"/>
-            <w:bottom w:w="0" w:type="dxa"/>
-          </w:tblCellMar>
-        </w:tblPrEx>
         <w:tc>
           <w:tcPr>
             <w:tcW w:w="2000" w:type="dxa"/>
@@ -818,12 +761,6 @@
         </w:tc>
       </w:tr>
       <w:tr>
-        <w:tblPrEx>
-          <w:tblCellMar>
-            <w:top w:w="0" w:type="dxa"/>
-            <w:bottom w:w="0" w:type="dxa"/>
-          </w:tblCellMar>
-        </w:tblPrEx>
         <w:tc>
           <w:tcPr>
             <w:tcW w:w="2000" w:type="dxa"/>
@@ -1083,12 +1020,6 @@
         <w:gridCol w:w="4576"/>
       </w:tblGrid>
       <w:tr>
-        <w:tblPrEx>
-          <w:tblCellMar>
-            <w:top w:w="0" w:type="dxa"/>
-            <w:bottom w:w="0" w:type="dxa"/>
-          </w:tblCellMar>
-        </w:tblPrEx>
         <w:trPr>
           <w:tblHeader/>
         </w:trPr>
@@ -1187,12 +1118,6 @@
         </w:tc>
       </w:tr>
       <w:tr>
-        <w:tblPrEx>
-          <w:tblCellMar>
-            <w:top w:w="0" w:type="dxa"/>
-            <w:bottom w:w="0" w:type="dxa"/>
-          </w:tblCellMar>
-        </w:tblPrEx>
         <w:tc>
           <w:tcPr>
             <w:tcW w:w="2200" w:type="dxa"/>
@@ -1280,12 +1205,6 @@
         </w:tc>
       </w:tr>
       <w:tr>
-        <w:tblPrEx>
-          <w:tblCellMar>
-            <w:top w:w="0" w:type="dxa"/>
-            <w:bottom w:w="0" w:type="dxa"/>
-          </w:tblCellMar>
-        </w:tblPrEx>
         <w:tc>
           <w:tcPr>
             <w:tcW w:w="2200" w:type="dxa"/>
@@ -1373,12 +1292,6 @@
         </w:tc>
       </w:tr>
       <w:tr>
-        <w:tblPrEx>
-          <w:tblCellMar>
-            <w:top w:w="0" w:type="dxa"/>
-            <w:bottom w:w="0" w:type="dxa"/>
-          </w:tblCellMar>
-        </w:tblPrEx>
         <w:tc>
           <w:tcPr>
             <w:tcW w:w="2200" w:type="dxa"/>
@@ -2325,6 +2238,9 @@
         <w:spacing w:before="60" w:after="60"/>
       </w:pPr>
       <w:r>
+        <w:rPr>
+          <w:noProof/>
+        </w:rPr>
         <w:drawing>
           <wp:inline distT="0" distB="0" distL="0" distR="0" wp14:anchorId="3607E680" wp14:editId="2289385C">
             <wp:extent cx="5943600" cy="3729355"/>
@@ -2367,6 +2283,9 @@
         <w:spacing w:before="60" w:after="60"/>
       </w:pPr>
       <w:r>
+        <w:rPr>
+          <w:noProof/>
+        </w:rPr>
         <w:lastRenderedPageBreak/>
         <w:drawing>
           <wp:inline distT="0" distB="0" distL="0" distR="0" wp14:anchorId="226AF081" wp14:editId="7B856368">
@@ -2437,16 +2356,14 @@
         </w:rPr>
         <w:t xml:space="preserve"> Sherika Fayson | SDC 320 </w:t>
       </w:r>
-      <w:proofErr w:type="gramStart"/>
       <w:r>
         <w:rPr>
           <w:color w:val="888888"/>
           <w:sz w:val="18"/>
           <w:szCs w:val="18"/>
         </w:rPr>
-        <w:t>|  May</w:t>
-      </w:r>
-      <w:proofErr w:type="gramEnd"/>
+        <w:t>| May</w:t>
+      </w:r>
       <w:r>
         <w:rPr>
           <w:color w:val="888888"/>

</xml_diff>